<commit_message>
auto(daily): dev loop report 2026-06-18
</commit_message>
<xml_diff>
--- a/reports/hypothesis/2026-06-18.docx
+++ b/reports/hypothesis/2026-06-18.docx
@@ -15,7 +15,7 @@
         <w:rPr>
           <w:i/>
         </w:rPr>
-        <w:t>생성일: 2026-06-18 09:15 KST  |  표본: 측정소당 최소 2580건 / 총 13075건</w:t>
+        <w:t>생성일: 2026-06-18 13:59 KST  |  표본: 측정소당 최소 2585건 / 총 13100건</w:t>
       </w:r>
     </w:p>
     <w:p>
@@ -143,7 +143,7 @@
           </w:tcPr>
           <w:p>
             <w:r>
-              <w:t>36.097</w:t>
+              <w:t>36.103</w:t>
             </w:r>
           </w:p>
         </w:tc>
@@ -153,7 +153,7 @@
           </w:tcPr>
           <w:p>
             <w:r>
-              <w:t>33.098</w:t>
+              <w:t>33.104</w:t>
             </w:r>
           </w:p>
         </w:tc>
@@ -215,7 +215,7 @@
           </w:tcPr>
           <w:p>
             <w:r>
-              <w:t>20.273</w:t>
+              <w:t>20.288</w:t>
             </w:r>
           </w:p>
         </w:tc>
@@ -225,7 +225,7 @@
           </w:tcPr>
           <w:p>
             <w:r>
-              <w:t>17.448</w:t>
+              <w:t>17.459</w:t>
             </w:r>
           </w:p>
         </w:tc>
@@ -235,7 +235,7 @@
           </w:tcPr>
           <w:p>
             <w:r>
-              <w:t>+2.825</w:t>
+              <w:t>+2.829</w:t>
             </w:r>
           </w:p>
         </w:tc>
@@ -513,7 +513,7 @@
           </w:tcPr>
           <w:p>
             <w:r>
-              <w:t>0.475</w:t>
+              <w:t>0.476</w:t>
             </w:r>
           </w:p>
         </w:tc>
@@ -722,7 +722,7 @@
           </w:tcPr>
           <w:p>
             <w:r>
-              <w:t>83.91</w:t>
+              <w:t>83.88</w:t>
             </w:r>
           </w:p>
         </w:tc>
@@ -784,7 +784,7 @@
           </w:tcPr>
           <w:p>
             <w:r>
-              <w:t>14.19</w:t>
+              <w:t>14.26</w:t>
             </w:r>
           </w:p>
         </w:tc>
@@ -846,7 +846,7 @@
           </w:tcPr>
           <w:p>
             <w:r>
-              <w:t>163.72</w:t>
+              <w:t>164.07</w:t>
             </w:r>
           </w:p>
         </w:tc>
@@ -908,7 +908,7 @@
           </w:tcPr>
           <w:p>
             <w:r>
-              <w:t>64.34</w:t>
+              <w:t>64.57</w:t>
             </w:r>
           </w:p>
         </w:tc>
@@ -970,7 +970,7 @@
           </w:tcPr>
           <w:p>
             <w:r>
-              <w:t>153.09</w:t>
+              <w:t>153.66</w:t>
             </w:r>
           </w:p>
         </w:tc>
@@ -1029,7 +1029,7 @@
         <w:pStyle w:val="ListBullet"/>
       </w:pPr>
       <w:r>
-        <w:t>'산단 영향군'가 '베이스라인'보다 평균 2.82 높음 (p=0.0000, 효과크기 작음 d=0.22).</w:t>
+        <w:t>'산단 영향군'가 '베이스라인'보다 평균 2.83 높음 (p=0.0000, 효과크기 작음 d=0.22).</w:t>
       </w:r>
     </w:p>
     <w:p>

</xml_diff>